<commit_message>
Revise logistics proposal copy
</commit_message>
<xml_diff>
--- a/Logistics_Platform_Proposal.docx
+++ b/Logistics_Platform_Proposal.docx
@@ -13,7 +13,7 @@
           <w:color w:val="1A376C"/>
           <w:sz w:val="52"/>
         </w:rPr>
-        <w:t>Logistics Platform Proposal</w:t>
+        <w:t>Strategic Logistics Platform Proposal</w:t>
       </w:r>
     </w:p>
     <w:p>
@@ -27,7 +27,7 @@
           <w:color w:val="007B83"/>
           <w:sz w:val="28"/>
         </w:rPr>
-        <w:t>Digital Workflows • Real-Time Visibility • Optimized Routes</w:t>
+        <w:t>Operational Clarity • Live Visibility • Smarter Routing</w:t>
       </w:r>
     </w:p>
     <w:p>
@@ -173,7 +173,7 @@
                 <w:color w:val="404040"/>
                 <w:sz w:val="21"/>
               </w:rPr>
-              <w:t>Logistics Platform Proposal</w:t>
+              <w:t>Strategic Logistics Platform Proposal</w:t>
             </w:r>
           </w:p>
         </w:tc>
@@ -247,7 +247,7 @@
           <w:color w:val="404040"/>
           <w:sz w:val="21"/>
         </w:rPr>
-        <w:t>This proposal presents a modern logistics platform that digitizes traditional workflows from shipment creation through delivery, settlement, and performance review. The solution connects shippers, carriers, and operations teams in one coordinated environment that reduces manual coordination and improves service reliability.</w:t>
+        <w:t>Many logistics teams still rely on phone calls, emails, and spreadsheets to plan shipments and track progress. This slows down assignment, increases coordination costs, and makes it hard to give customers reliable updates.</w:t>
       </w:r>
     </w:p>
     <w:p>
@@ -259,7 +259,19 @@
           <w:color w:val="404040"/>
           <w:sz w:val="21"/>
         </w:rPr>
-        <w:t>The platform prioritizes real-time live shipment tracking and intelligent route optimization to deliver accurate ETAs, proactive exception management, and superior customer experience.</w:t>
+        <w:t>The proposed platform brings shipment creation, carrier selection, tracking, and performance management into one clear workflow. It reduces manual work, improves on-time delivery, and gives leadership the visibility needed to make better decisions.</w:t>
+      </w:r>
+    </w:p>
+    <w:p>
+      <w:pPr>
+        <w:spacing w:after="120"/>
+      </w:pPr>
+      <w:r>
+        <w:rPr>
+          <w:color w:val="404040"/>
+          <w:sz w:val="21"/>
+        </w:rPr>
+        <w:t>By combining live tracking with route optimization, the platform improves customer experience and provides a competitive advantage through faster, more predictable service.</w:t>
       </w:r>
     </w:p>
     <w:tbl>
@@ -284,7 +296,7 @@
                 <w:color w:val="1A376C"/>
                 <w:sz w:val="22"/>
               </w:rPr>
-              <w:t>Business Outcomes</w:t>
+              <w:t>Expected Business Results</w:t>
             </w:r>
           </w:p>
           <w:p>
@@ -296,7 +308,7 @@
                 <w:color w:val="404040"/>
                 <w:sz w:val="21"/>
               </w:rPr>
-              <w:t>Cut dispatch time with smart shipment creation and automated carrier matching.</w:t>
+              <w:t>Faster shipment assignment with fewer manual follow-ups.</w:t>
             </w:r>
           </w:p>
           <w:p>
@@ -308,7 +320,7 @@
                 <w:color w:val="404040"/>
                 <w:sz w:val="21"/>
               </w:rPr>
-              <w:t>Improve on-time performance using live tracking and predictive ETAs.</w:t>
+              <w:t>Lower operating costs through smarter routing and reduced empty miles.</w:t>
             </w:r>
           </w:p>
           <w:p>
@@ -320,7 +332,7 @@
                 <w:color w:val="404040"/>
                 <w:sz w:val="21"/>
               </w:rPr>
-              <w:t>Reduce cost per shipment by minimizing empty miles and route deviations.</w:t>
+              <w:t>Higher customer satisfaction with accurate ETAs and proactive updates.</w:t>
             </w:r>
           </w:p>
           <w:p>
@@ -332,7 +344,7 @@
                 <w:color w:val="404040"/>
                 <w:sz w:val="21"/>
               </w:rPr>
-              <w:t>Increase shipper confidence with transparent status events and proof of delivery.</w:t>
+              <w:t>Stronger carrier performance through transparent accountability.</w:t>
             </w:r>
           </w:p>
         </w:tc>
@@ -363,7 +375,7 @@
           <w:color w:val="404040"/>
           <w:sz w:val="21"/>
         </w:rPr>
-        <w:t>The platform unifies shipment planning, carrier selection, execution, and settlement in a single digital workflow. It supports multi-tenant operations, configurable approval rules, and API-ready integration for ERP, TMS, and financial systems.</w:t>
+        <w:t>The platform provides a single place to manage shipments, carriers, status updates, and financial settlement. It is designed for operations teams and decision makers who need simple, reliable information and consistent processes across locations and partners.</w:t>
       </w:r>
     </w:p>
     <w:p>
@@ -404,7 +416,7 @@
           <w:color w:val="404040"/>
           <w:sz w:val="21"/>
         </w:rPr>
-        <w:t>Create shipments in seconds with structured templates, service-level rules, and automatic carrier matching based on lanes, capacity, price, and performance history.</w:t>
+        <w:t>Operations teams can create shipments quickly with guided forms and reusable templates. The system matches loads to available carriers based on capacity, cost, and past performance, reducing back-and-forth calls and speeding assignment.</w:t>
       </w:r>
     </w:p>
     <w:p>
@@ -418,14 +430,14 @@
           <w:color w:val="1A376C"/>
           <w:sz w:val="21"/>
         </w:rPr>
-        <w:t>Guided shipment forms:</w:t>
+        <w:t>Fast shipment setup:</w:t>
       </w:r>
       <w:r>
         <w:rPr>
           <w:color w:val="404040"/>
           <w:sz w:val="21"/>
         </w:rPr>
-        <w:t xml:space="preserve"> Validated fields, commodity rules, and document capture.</w:t>
+        <w:t xml:space="preserve"> Standard templates reduce errors and rework.</w:t>
       </w:r>
     </w:p>
     <w:p>
@@ -439,14 +451,14 @@
           <w:color w:val="1A376C"/>
           <w:sz w:val="21"/>
         </w:rPr>
-        <w:t>Posting &amp; tendering:</w:t>
+        <w:t>Carrier recommendations:</w:t>
       </w:r>
       <w:r>
         <w:rPr>
           <w:color w:val="404040"/>
           <w:sz w:val="21"/>
         </w:rPr>
-        <w:t xml:space="preserve"> Broadcast to qualified carriers with configurable acceptance flows.</w:t>
+        <w:t xml:space="preserve"> Qualified carriers are suggested instantly.</w:t>
       </w:r>
     </w:p>
     <w:p>
@@ -460,14 +472,14 @@
           <w:color w:val="1A376C"/>
           <w:sz w:val="21"/>
         </w:rPr>
-        <w:t>Carrier marketplace:</w:t>
+        <w:t>Quick posting &amp; acceptance:</w:t>
       </w:r>
       <w:r>
         <w:rPr>
           <w:color w:val="404040"/>
           <w:sz w:val="21"/>
         </w:rPr>
-        <w:t xml:space="preserve"> Rate cards, spot bids, and smart recommendations.</w:t>
+        <w:t xml:space="preserve"> Shorten the time from request to confirmed assignment.</w:t>
       </w:r>
     </w:p>
     <w:p>
@@ -481,14 +493,14 @@
           <w:color w:val="1A376C"/>
           <w:sz w:val="21"/>
         </w:rPr>
-        <w:t>Approval workflows:</w:t>
+        <w:t>Better carrier utilization:</w:t>
       </w:r>
       <w:r>
         <w:rPr>
           <w:color w:val="404040"/>
           <w:sz w:val="21"/>
         </w:rPr>
-        <w:t xml:space="preserve"> Enforce budget limits and service SLAs before confirmation.</w:t>
+        <w:t xml:space="preserve"> Use available capacity more efficiently.</w:t>
       </w:r>
     </w:p>
     <w:p>
@@ -514,7 +526,7 @@
           <w:color w:val="404040"/>
           <w:sz w:val="21"/>
         </w:rPr>
-        <w:t>Every shipment is monitored through milestones, exceptions, and automated status events to keep teams and customers aligned.</w:t>
+        <w:t>Shipments are tracked through clear milestones and exceptions so teams stay aligned and customers receive consistent updates.</w:t>
       </w:r>
     </w:p>
     <w:p>
@@ -528,7 +540,7 @@
           <w:color w:val="1A376C"/>
           <w:sz w:val="21"/>
         </w:rPr>
-        <w:t>Milestone updates:</w:t>
+        <w:t>Milestone visibility:</w:t>
       </w:r>
       <w:r>
         <w:rPr>
@@ -556,7 +568,7 @@
           <w:color w:val="404040"/>
           <w:sz w:val="21"/>
         </w:rPr>
-        <w:t xml:space="preserve"> Delays, route deviations, temperature issues, or dwell-time flags.</w:t>
+        <w:t xml:space="preserve"> Delays, route deviations, and dwell-time issues flagged early.</w:t>
       </w:r>
     </w:p>
     <w:p>
@@ -577,7 +589,7 @@
           <w:color w:val="404040"/>
           <w:sz w:val="21"/>
         </w:rPr>
-        <w:t xml:space="preserve"> Email/SMS updates with configurable frequency.</w:t>
+        <w:t xml:space="preserve"> Automated updates reduce inbound status calls.</w:t>
       </w:r>
     </w:p>
     <w:p>
@@ -591,14 +603,14 @@
           <w:color w:val="1A376C"/>
           <w:sz w:val="21"/>
         </w:rPr>
-        <w:t>Document management:</w:t>
+        <w:t>Proof of delivery:</w:t>
       </w:r>
       <w:r>
         <w:rPr>
           <w:color w:val="404040"/>
           <w:sz w:val="21"/>
         </w:rPr>
-        <w:t xml:space="preserve"> Proof of delivery, signatures, and shipping documents stored centrally.</w:t>
+        <w:t xml:space="preserve"> Documents and signatures stored in one place.</w:t>
       </w:r>
     </w:p>
     <w:p>
@@ -624,7 +636,7 @@
           <w:color w:val="404040"/>
           <w:sz w:val="21"/>
         </w:rPr>
-        <w:t>Integrated payment workflows simplify invoicing, reconciliation, and carrier settlement while improving cashflow visibility.</w:t>
+        <w:t>Payment workflows are simplified so finance teams can invoice faster and resolve disputes with clear documentation.</w:t>
       </w:r>
     </w:p>
     <w:p>
@@ -645,7 +657,7 @@
           <w:color w:val="404040"/>
           <w:sz w:val="21"/>
         </w:rPr>
-        <w:t xml:space="preserve"> Generate invoices from completed shipments and rate cards.</w:t>
+        <w:t xml:space="preserve"> Generate invoices directly from completed shipments.</w:t>
       </w:r>
     </w:p>
     <w:p>
@@ -659,14 +671,14 @@
           <w:color w:val="1A376C"/>
           <w:sz w:val="21"/>
         </w:rPr>
-        <w:t>Dispute handling:</w:t>
+        <w:t>Dispute tracking:</w:t>
       </w:r>
       <w:r>
         <w:rPr>
           <w:color w:val="404040"/>
           <w:sz w:val="21"/>
         </w:rPr>
-        <w:t xml:space="preserve"> Track discrepancies with audit trails and approval history.</w:t>
+        <w:t xml:space="preserve"> Reduce friction with auditable shipment history.</w:t>
       </w:r>
     </w:p>
     <w:p>
@@ -680,14 +692,14 @@
           <w:color w:val="1A376C"/>
           <w:sz w:val="21"/>
         </w:rPr>
-        <w:t>Carrier payouts:</w:t>
+        <w:t>Payment visibility:</w:t>
       </w:r>
       <w:r>
         <w:rPr>
           <w:color w:val="404040"/>
           <w:sz w:val="21"/>
         </w:rPr>
-        <w:t xml:space="preserve"> Scheduled settlements with payment status visibility.</w:t>
+        <w:t xml:space="preserve"> Know what is pending, approved, and paid.</w:t>
       </w:r>
     </w:p>
     <w:p>
@@ -701,14 +713,14 @@
           <w:color w:val="1A376C"/>
           <w:sz w:val="21"/>
         </w:rPr>
-        <w:t>Revenue dashboards:</w:t>
+        <w:t>Profitability insights:</w:t>
       </w:r>
       <w:r>
         <w:rPr>
           <w:color w:val="404040"/>
           <w:sz w:val="21"/>
         </w:rPr>
-        <w:t xml:space="preserve"> Margin, cost per mile, and profitability analytics.</w:t>
+        <w:t xml:space="preserve"> Track cost per shipment and margin trends.</w:t>
       </w:r>
     </w:p>
     <w:p>
@@ -735,7 +747,19 @@
           <w:color w:val="404040"/>
           <w:sz w:val="21"/>
         </w:rPr>
-        <w:t>Live tracking is the centerpiece of the platform. It provides continuous, map-based visibility for every shipment, enabling teams to intervene early, reassure customers, and protect service-level commitments.</w:t>
+        <w:t>Live tracking gives operations teams continuous visibility into every shipment. The platform supports both GPS tracking devices and smartphone-based driver tracking, allowing you to choose the right approach by fleet and cost model.</w:t>
+      </w:r>
+    </w:p>
+    <w:p>
+      <w:pPr>
+        <w:spacing w:after="120"/>
+      </w:pPr>
+      <w:r>
+        <w:rPr>
+          <w:color w:val="404040"/>
+          <w:sz w:val="21"/>
+        </w:rPr>
+        <w:t>Smartphone tracking reduces hardware costs and enables faster onboarding for contractors or seasonal fleets without sacrificing real-time visibility.</w:t>
       </w:r>
     </w:p>
     <w:p>
@@ -749,14 +773,56 @@
           <w:color w:val="1A376C"/>
           <w:sz w:val="21"/>
         </w:rPr>
-        <w:t>Instant visibility:</w:t>
+        <w:t>Device and smartphone tracking:</w:t>
       </w:r>
       <w:r>
         <w:rPr>
           <w:color w:val="404040"/>
           <w:sz w:val="21"/>
         </w:rPr>
-        <w:t xml:space="preserve"> Second-by-second location updates from carrier devices and mobile apps.</w:t>
+        <w:t xml:space="preserve"> Use existing GPS units or driver phones.</w:t>
+      </w:r>
+    </w:p>
+    <w:p>
+      <w:pPr>
+        <w:pStyle w:val="ListBullet"/>
+        <w:spacing w:after="80"/>
+      </w:pPr>
+      <w:r>
+        <w:rPr>
+          <w:b/>
+          <w:color w:val="1A376C"/>
+          <w:sz w:val="21"/>
+        </w:rPr>
+        <w:t>Lower hardware costs:</w:t>
+      </w:r>
+      <w:r>
+        <w:rPr>
+          <w:color w:val="404040"/>
+          <w:sz w:val="21"/>
+        </w:rPr>
+        <w:t xml:space="preserve"> Reduce spend by relying on smartphone tracking where suitable.</w:t>
+      </w:r>
+    </w:p>
+    <w:p>
+      <w:pPr>
+        <w:pStyle w:val="ListBullet"/>
+        <w:spacing w:after="80"/>
+      </w:pPr>
+      <w:r>
+        <w:rPr>
+          <w:b/>
+          <w:color w:val="1A376C"/>
+          <w:sz w:val="21"/>
+        </w:rPr>
+        <w:t>Faster adoption:</w:t>
+      </w:r>
+      <w:r>
+        <w:rPr>
+          <w:color w:val="404040"/>
+          <w:sz w:val="21"/>
+        </w:rPr>
+        <w:t xml:space="preserve"> Bring new drivers online quickly without device rollout delays.</w:t>
       </w:r>
     </w:p>
     <w:p>
@@ -777,7 +843,7 @@
           <w:color w:val="404040"/>
           <w:sz w:val="21"/>
         </w:rPr>
-        <w:t xml:space="preserve"> Trigger alerts the moment a shipment is off-route or delayed.</w:t>
+        <w:t xml:space="preserve"> Act early when shipments fall behind schedule.</w:t>
       </w:r>
     </w:p>
     <w:p>
@@ -791,35 +857,14 @@
           <w:color w:val="1A376C"/>
           <w:sz w:val="21"/>
         </w:rPr>
-        <w:t>Trusted ETAs:</w:t>
+        <w:t>Customer-facing visibility:</w:t>
       </w:r>
       <w:r>
         <w:rPr>
           <w:color w:val="404040"/>
           <w:sz w:val="21"/>
         </w:rPr>
-        <w:t xml:space="preserve"> Live feeds refine arrival estimates to reduce missed deliveries.</w:t>
-      </w:r>
-    </w:p>
-    <w:p>
-      <w:pPr>
-        <w:pStyle w:val="ListBullet"/>
-        <w:spacing w:after="80"/>
-      </w:pPr>
-      <w:r>
-        <w:rPr>
-          <w:b/>
-          <w:color w:val="1A376C"/>
-          <w:sz w:val="21"/>
-        </w:rPr>
-        <w:t>Customer confidence:</w:t>
-      </w:r>
-      <w:r>
-        <w:rPr>
-          <w:color w:val="404040"/>
-          <w:sz w:val="21"/>
-        </w:rPr>
-        <w:t xml:space="preserve"> Shareable tracking links reduce inbound status calls.</w:t>
+        <w:t xml:space="preserve"> Shareable tracking links build trust and reduce calls.</w:t>
       </w:r>
     </w:p>
     <w:p>
@@ -846,7 +891,7 @@
           <w:color w:val="404040"/>
           <w:sz w:val="21"/>
         </w:rPr>
-        <w:t>Route optimization turns operational data into direct cost savings. The platform analyzes distance, traffic, stop sequences, and delivery constraints to recommend the best route and continuously update ETAs as conditions change.</w:t>
+        <w:t>Route optimization reduces cost and improves delivery reliability by recommending the best path and stop sequence for each shipment. ETAs are refreshed as conditions change so planning remains accurate throughout the day.</w:t>
       </w:r>
     </w:p>
     <w:p>
@@ -860,14 +905,14 @@
           <w:color w:val="1A376C"/>
           <w:sz w:val="21"/>
         </w:rPr>
-        <w:t>Lower operating costs:</w:t>
+        <w:t>Reduced fuel costs:</w:t>
       </w:r>
       <w:r>
         <w:rPr>
           <w:color w:val="404040"/>
           <w:sz w:val="21"/>
         </w:rPr>
-        <w:t xml:space="preserve"> Reduce fuel spend and empty miles with optimized routing.</w:t>
+        <w:t xml:space="preserve"> Shorter routes and fewer detours lower spend.</w:t>
       </w:r>
     </w:p>
     <w:p>
@@ -881,14 +926,14 @@
           <w:color w:val="1A376C"/>
           <w:sz w:val="21"/>
         </w:rPr>
-        <w:t>On-time delivery gains:</w:t>
+        <w:t>Better vehicle utilization:</w:t>
       </w:r>
       <w:r>
         <w:rPr>
           <w:color w:val="404040"/>
           <w:sz w:val="21"/>
         </w:rPr>
-        <w:t xml:space="preserve"> Prioritized stop sequencing and dynamic re-routing.</w:t>
+        <w:t xml:space="preserve"> Balance workloads and reduce empty miles.</w:t>
       </w:r>
     </w:p>
     <w:p>
@@ -902,14 +947,14 @@
           <w:color w:val="1A376C"/>
           <w:sz w:val="21"/>
         </w:rPr>
-        <w:t>Accurate planning:</w:t>
+        <w:t>Faster deliveries:</w:t>
       </w:r>
       <w:r>
         <w:rPr>
           <w:color w:val="404040"/>
           <w:sz w:val="21"/>
         </w:rPr>
-        <w:t xml:space="preserve"> ETA predictions update with live conditions and driver status.</w:t>
+        <w:t xml:space="preserve"> Traffic-aware routing and smarter stop sequencing.</w:t>
       </w:r>
     </w:p>
     <w:p>
@@ -923,14 +968,14 @@
           <w:color w:val="1A376C"/>
           <w:sz w:val="21"/>
         </w:rPr>
-        <w:t>Better asset utilization:</w:t>
+        <w:t>Improved planning:</w:t>
       </w:r>
       <w:r>
         <w:rPr>
           <w:color w:val="404040"/>
           <w:sz w:val="21"/>
         </w:rPr>
-        <w:t xml:space="preserve"> Balance workloads and maximize fleet productivity.</w:t>
+        <w:t xml:space="preserve"> Reliable ETAs help staffing and customer commitments.</w:t>
       </w:r>
     </w:p>
     <w:p>
@@ -957,7 +1002,7 @@
           <w:color w:val="404040"/>
           <w:sz w:val="21"/>
         </w:rPr>
-        <w:t>A review and rating system builds accountability and improves carrier performance over time.</w:t>
+        <w:t>A structured ratings and reviews program strengthens accountability and helps improve service quality over time.</w:t>
       </w:r>
     </w:p>
     <w:p>
@@ -971,14 +1016,14 @@
           <w:color w:val="1A376C"/>
           <w:sz w:val="21"/>
         </w:rPr>
-        <w:t>Post-delivery ratings:</w:t>
+        <w:t>Accountability:</w:t>
       </w:r>
       <w:r>
         <w:rPr>
           <w:color w:val="404040"/>
           <w:sz w:val="21"/>
         </w:rPr>
-        <w:t xml:space="preserve"> Shippers rate carriers and drivers on service quality.</w:t>
+        <w:t xml:space="preserve"> Performance is tracked against clear delivery expectations.</w:t>
       </w:r>
     </w:p>
     <w:p>
@@ -992,14 +1037,14 @@
           <w:color w:val="1A376C"/>
           <w:sz w:val="21"/>
         </w:rPr>
-        <w:t>Performance scorecards:</w:t>
+        <w:t>Service quality:</w:t>
       </w:r>
       <w:r>
         <w:rPr>
           <w:color w:val="404040"/>
           <w:sz w:val="21"/>
         </w:rPr>
-        <w:t xml:space="preserve"> On-time %, damage rate, and compliance metrics.</w:t>
+        <w:t xml:space="preserve"> Highlight top carriers and address repeated issues.</w:t>
       </w:r>
     </w:p>
     <w:p>
@@ -1013,14 +1058,14 @@
           <w:color w:val="1A376C"/>
           <w:sz w:val="21"/>
         </w:rPr>
-        <w:t>Carrier qualification:</w:t>
+        <w:t>Trust and transparency:</w:t>
       </w:r>
       <w:r>
         <w:rPr>
           <w:color w:val="404040"/>
           <w:sz w:val="21"/>
         </w:rPr>
-        <w:t xml:space="preserve"> Automated eligibility rules based on historical performance.</w:t>
+        <w:t xml:space="preserve"> Shared feedback builds confidence across partners.</w:t>
       </w:r>
     </w:p>
     <w:p>
@@ -1034,14 +1079,14 @@
           <w:color w:val="1A376C"/>
           <w:sz w:val="21"/>
         </w:rPr>
-        <w:t>Issue resolution:</w:t>
+        <w:t>Performance monitoring:</w:t>
       </w:r>
       <w:r>
         <w:rPr>
           <w:color w:val="404040"/>
           <w:sz w:val="21"/>
         </w:rPr>
-        <w:t xml:space="preserve"> Structured feedback loops for continuous improvement.</w:t>
+        <w:t xml:space="preserve"> Scorecards track on-time rates, damage, and responsiveness.</w:t>
       </w:r>
     </w:p>
     <w:p>
@@ -1068,7 +1113,7 @@
           <w:color w:val="404040"/>
           <w:sz w:val="21"/>
         </w:rPr>
-        <w:t>Supporting features ensure the platform is easy to adopt and scales with operational needs.</w:t>
+        <w:t>Supporting features make the platform easy to operate day to day and scalable across the business.</w:t>
       </w:r>
     </w:p>
     <w:p>
@@ -1089,7 +1134,7 @@
           <w:color w:val="404040"/>
           <w:sz w:val="21"/>
         </w:rPr>
-        <w:t xml:space="preserve"> Granular permissions for shippers, carriers, and admins.</w:t>
+        <w:t xml:space="preserve"> Each team sees only what they need.</w:t>
       </w:r>
     </w:p>
     <w:p>
@@ -1103,14 +1148,14 @@
           <w:color w:val="1A376C"/>
           <w:sz w:val="21"/>
         </w:rPr>
-        <w:t>Analytics dashboards:</w:t>
+        <w:t>Operational dashboards:</w:t>
       </w:r>
       <w:r>
         <w:rPr>
           <w:color w:val="404040"/>
           <w:sz w:val="21"/>
         </w:rPr>
-        <w:t xml:space="preserve"> Shipment volume, cost trends, and service KPIs.</w:t>
+        <w:t xml:space="preserve"> Track volume, cost, and service KPIs.</w:t>
       </w:r>
     </w:p>
     <w:p>
@@ -1124,14 +1169,14 @@
           <w:color w:val="1A376C"/>
           <w:sz w:val="21"/>
         </w:rPr>
-        <w:t>Integration APIs:</w:t>
+        <w:t>System integrations:</w:t>
       </w:r>
       <w:r>
         <w:rPr>
           <w:color w:val="404040"/>
           <w:sz w:val="21"/>
         </w:rPr>
-        <w:t xml:space="preserve"> Connect ERP, WMS, and accounting systems securely.</w:t>
+        <w:t xml:space="preserve"> Connect finance, warehouse, and ERP tools.</w:t>
       </w:r>
     </w:p>
     <w:p>
@@ -1145,14 +1190,14 @@
           <w:color w:val="1A376C"/>
           <w:sz w:val="21"/>
         </w:rPr>
-        <w:t>Multi-branch operations:</w:t>
+        <w:t>Multi-branch support:</w:t>
       </w:r>
       <w:r>
         <w:rPr>
           <w:color w:val="404040"/>
           <w:sz w:val="21"/>
         </w:rPr>
-        <w:t xml:space="preserve"> Support regional offices and partner networks.</w:t>
+        <w:t xml:space="preserve"> Standardize processes across locations.</w:t>
       </w:r>
     </w:p>
     <w:p>
@@ -1179,7 +1224,7 @@
           <w:color w:val="404040"/>
           <w:sz w:val="21"/>
         </w:rPr>
-        <w:t>Security, uptime, and data integrity are built into every layer of the platform.</w:t>
+        <w:t>Security and reliability are built in so the platform can be trusted for daily operations.</w:t>
       </w:r>
     </w:p>
     <w:p>
@@ -1193,14 +1238,14 @@
           <w:color w:val="1A376C"/>
           <w:sz w:val="21"/>
         </w:rPr>
-        <w:t>Encrypted communications:</w:t>
+        <w:t>Secure access controls:</w:t>
       </w:r>
       <w:r>
         <w:rPr>
           <w:color w:val="404040"/>
           <w:sz w:val="21"/>
         </w:rPr>
-        <w:t xml:space="preserve"> TLS-secured APIs and device connections.</w:t>
+        <w:t xml:space="preserve"> Protect sensitive shipment and customer data.</w:t>
       </w:r>
     </w:p>
     <w:p>
@@ -1214,14 +1259,14 @@
           <w:color w:val="1A376C"/>
           <w:sz w:val="21"/>
         </w:rPr>
-        <w:t>Audit logging:</w:t>
+        <w:t>Audit trails:</w:t>
       </w:r>
       <w:r>
         <w:rPr>
           <w:color w:val="404040"/>
           <w:sz w:val="21"/>
         </w:rPr>
-        <w:t xml:space="preserve"> Track every user action and shipment update.</w:t>
+        <w:t xml:space="preserve"> Maintain a clear record of key actions and updates.</w:t>
       </w:r>
     </w:p>
     <w:p>
@@ -1235,14 +1280,14 @@
           <w:color w:val="1A376C"/>
           <w:sz w:val="21"/>
         </w:rPr>
-        <w:t>High availability:</w:t>
+        <w:t>Reliable availability:</w:t>
       </w:r>
       <w:r>
         <w:rPr>
           <w:color w:val="404040"/>
           <w:sz w:val="21"/>
         </w:rPr>
-        <w:t xml:space="preserve"> Redundant services and automated backups.</w:t>
+        <w:t xml:space="preserve"> Designed for daily use with backups and monitoring.</w:t>
       </w:r>
     </w:p>
     <w:p>
@@ -1256,14 +1301,14 @@
           <w:color w:val="1A376C"/>
           <w:sz w:val="21"/>
         </w:rPr>
-        <w:t>Data residency options:</w:t>
+        <w:t>Deployment flexibility:</w:t>
       </w:r>
       <w:r>
         <w:rPr>
           <w:color w:val="404040"/>
           <w:sz w:val="21"/>
         </w:rPr>
-        <w:t xml:space="preserve"> Deploy on-premise or in approved cloud regions.</w:t>
+        <w:t xml:space="preserve"> Cloud or on-premise options based on policy.</w:t>
       </w:r>
     </w:p>
     <w:p>
@@ -1290,7 +1335,7 @@
           <w:color w:val="404040"/>
           <w:sz w:val="21"/>
         </w:rPr>
-        <w:t>We deliver a structured rollout plan focused on adoption, performance, and measurable ROI.</w:t>
+        <w:t>We provide a structured rollout that delivers value quickly and minimizes operational risk.</w:t>
       </w:r>
     </w:p>
     <w:p>
@@ -1304,14 +1349,14 @@
           <w:color w:val="1A376C"/>
           <w:sz w:val="21"/>
         </w:rPr>
-        <w:t>Discovery workshops:</w:t>
+        <w:t>Discovery &amp; planning:</w:t>
       </w:r>
       <w:r>
         <w:rPr>
           <w:color w:val="404040"/>
           <w:sz w:val="21"/>
         </w:rPr>
-        <w:t xml:space="preserve"> Confirm workflows, lanes, and carrier network requirements.</w:t>
+        <w:t xml:space="preserve"> Confirm workflows, lanes, and carrier network needs.</w:t>
       </w:r>
     </w:p>
     <w:p>
@@ -1325,14 +1370,14 @@
           <w:color w:val="1A376C"/>
           <w:sz w:val="21"/>
         </w:rPr>
-        <w:t>Configuration &amp; onboarding:</w:t>
+        <w:t>Configuration &amp; training:</w:t>
       </w:r>
       <w:r>
         <w:rPr>
           <w:color w:val="404040"/>
           <w:sz w:val="21"/>
         </w:rPr>
-        <w:t xml:space="preserve"> Set up workflows, roles, and integrations.</w:t>
+        <w:t xml:space="preserve"> Set up workflows and onboard teams.</w:t>
       </w:r>
     </w:p>
     <w:p>
@@ -1353,7 +1398,7 @@
           <w:color w:val="404040"/>
           <w:sz w:val="21"/>
         </w:rPr>
-        <w:t xml:space="preserve"> Validate real-time tracking and route optimization impact.</w:t>
+        <w:t xml:space="preserve"> Prove value with a controlled rollout.</w:t>
       </w:r>
     </w:p>
     <w:p>
@@ -1367,14 +1412,14 @@
           <w:color w:val="1A376C"/>
           <w:sz w:val="21"/>
         </w:rPr>
-        <w:t>Ongoing success:</w:t>
+        <w:t>Ongoing support:</w:t>
       </w:r>
       <w:r>
         <w:rPr>
           <w:color w:val="404040"/>
           <w:sz w:val="21"/>
         </w:rPr>
-        <w:t xml:space="preserve"> Continuous optimization and feature enhancements.</w:t>
+        <w:t xml:space="preserve"> Continuous improvement and operational assistance.</w:t>
       </w:r>
     </w:p>
     <w:p>
@@ -1401,7 +1446,182 @@
           <w:color w:val="404040"/>
           <w:sz w:val="21"/>
         </w:rPr>
-        <w:t>This logistics platform delivers a measurable uplift in visibility, cost control, and service quality. By combining real-time tracking with route intelligence, teams gain the confidence to promise tighter delivery windows and consistently meet them.</w:t>
+        <w:t>Traditional logistics operations often depend on phone calls, spreadsheets, and manual follow-ups. This leads to delays, inconsistent data, and limited visibility.</w:t>
+      </w:r>
+    </w:p>
+    <w:p>
+      <w:pPr>
+        <w:pStyle w:val="Heading2"/>
+        <w:spacing w:before="200" w:after="80"/>
+      </w:pPr>
+      <w:r>
+        <w:rPr>
+          <w:b/>
+          <w:color w:val="007B83"/>
+          <w:sz w:val="22"/>
+        </w:rPr>
+        <w:t>Traditional Operations</w:t>
+      </w:r>
+    </w:p>
+    <w:p>
+      <w:pPr>
+        <w:pStyle w:val="ListBullet"/>
+        <w:spacing w:after="80"/>
+      </w:pPr>
+      <w:r>
+        <w:rPr>
+          <w:b/>
+          <w:color w:val="1A376C"/>
+          <w:sz w:val="21"/>
+        </w:rPr>
+        <w:t>Phone calls and emails:</w:t>
+      </w:r>
+      <w:r>
+        <w:rPr>
+          <w:color w:val="404040"/>
+          <w:sz w:val="21"/>
+        </w:rPr>
+        <w:t xml:space="preserve"> Status updates depend on people being available.</w:t>
+      </w:r>
+    </w:p>
+    <w:p>
+      <w:pPr>
+        <w:pStyle w:val="ListBullet"/>
+        <w:spacing w:after="80"/>
+      </w:pPr>
+      <w:r>
+        <w:rPr>
+          <w:b/>
+          <w:color w:val="1A376C"/>
+          <w:sz w:val="21"/>
+        </w:rPr>
+        <w:t>Spreadsheets:</w:t>
+      </w:r>
+      <w:r>
+        <w:rPr>
+          <w:color w:val="404040"/>
+          <w:sz w:val="21"/>
+        </w:rPr>
+        <w:t xml:space="preserve"> Data is fragmented and quickly out of date.</w:t>
+      </w:r>
+    </w:p>
+    <w:p>
+      <w:pPr>
+        <w:pStyle w:val="ListBullet"/>
+        <w:spacing w:after="80"/>
+      </w:pPr>
+      <w:r>
+        <w:rPr>
+          <w:b/>
+          <w:color w:val="1A376C"/>
+          <w:sz w:val="21"/>
+        </w:rPr>
+        <w:t>Manual coordination:</w:t>
+      </w:r>
+      <w:r>
+        <w:rPr>
+          <w:color w:val="404040"/>
+          <w:sz w:val="21"/>
+        </w:rPr>
+        <w:t xml:space="preserve"> Assignment and follow-up take time and increase errors.</w:t>
+      </w:r>
+    </w:p>
+    <w:p>
+      <w:pPr>
+        <w:pStyle w:val="Heading2"/>
+        <w:spacing w:before="200" w:after="80"/>
+      </w:pPr>
+      <w:r>
+        <w:rPr>
+          <w:b/>
+          <w:color w:val="007B83"/>
+          <w:sz w:val="22"/>
+        </w:rPr>
+        <w:t>With the Proposed Platform</w:t>
+      </w:r>
+    </w:p>
+    <w:p>
+      <w:pPr>
+        <w:pStyle w:val="ListBullet"/>
+        <w:spacing w:after="80"/>
+      </w:pPr>
+      <w:r>
+        <w:rPr>
+          <w:b/>
+          <w:color w:val="1A376C"/>
+          <w:sz w:val="21"/>
+        </w:rPr>
+        <w:t>Centralized operations:</w:t>
+      </w:r>
+      <w:r>
+        <w:rPr>
+          <w:color w:val="404040"/>
+          <w:sz w:val="21"/>
+        </w:rPr>
+        <w:t xml:space="preserve"> All shipments, carriers, and updates in one place.</w:t>
+      </w:r>
+    </w:p>
+    <w:p>
+      <w:pPr>
+        <w:pStyle w:val="ListBullet"/>
+        <w:spacing w:after="80"/>
+      </w:pPr>
+      <w:r>
+        <w:rPr>
+          <w:b/>
+          <w:color w:val="1A376C"/>
+          <w:sz w:val="21"/>
+        </w:rPr>
+        <w:t>Real-time visibility:</w:t>
+      </w:r>
+      <w:r>
+        <w:rPr>
+          <w:color w:val="404040"/>
+          <w:sz w:val="21"/>
+        </w:rPr>
+        <w:t xml:space="preserve"> Live tracking and alerts reduce surprises.</w:t>
+      </w:r>
+    </w:p>
+    <w:p>
+      <w:pPr>
+        <w:pStyle w:val="ListBullet"/>
+        <w:spacing w:after="80"/>
+      </w:pPr>
+      <w:r>
+        <w:rPr>
+          <w:b/>
+          <w:color w:val="1A376C"/>
+          <w:sz w:val="21"/>
+        </w:rPr>
+        <w:t>Better decision making:</w:t>
+      </w:r>
+      <w:r>
+        <w:rPr>
+          <w:color w:val="404040"/>
+          <w:sz w:val="21"/>
+        </w:rPr>
+        <w:t xml:space="preserve"> Reliable data supports faster, smarter choices.</w:t>
+      </w:r>
+    </w:p>
+    <w:p>
+      <w:pPr>
+        <w:pStyle w:val="ListBullet"/>
+        <w:spacing w:after="80"/>
+      </w:pPr>
+      <w:r>
+        <w:rPr>
+          <w:b/>
+          <w:color w:val="1A376C"/>
+          <w:sz w:val="21"/>
+        </w:rPr>
+        <w:t>Improved efficiency:</w:t>
+      </w:r>
+      <w:r>
+        <w:rPr>
+          <w:color w:val="404040"/>
+          <w:sz w:val="21"/>
+        </w:rPr>
+        <w:t xml:space="preserve"> Less manual work and clearer accountability.</w:t>
       </w:r>
     </w:p>
     <w:p>
@@ -1413,7 +1633,424 @@
           <w:color w:val="404040"/>
           <w:sz w:val="21"/>
         </w:rPr>
-        <w:t>We welcome the opportunity to tailor the platform to your operational model and launch a pilot that proves value quickly before scaling to full production.</w:t>
+        <w:t>The result is a more predictable logistics operation with lower costs and stronger service quality for customers.</w:t>
+      </w:r>
+    </w:p>
+    <w:p>
+      <w:pPr>
+        <w:pStyle w:val="Heading1"/>
+        <w:spacing w:before="280" w:after="120"/>
+        <w:shd w:val="clear" w:color="auto" w:fill="1A376C"/>
+      </w:pPr>
+      <w:r>
+        <w:rPr>
+          <w:b/>
+          <w:color w:val="FFFFFF"/>
+          <w:sz w:val="26"/>
+        </w:rPr>
+        <w:t xml:space="preserve">  11.  Development Approach</w:t>
+      </w:r>
+    </w:p>
+    <w:p>
+      <w:pPr>
+        <w:spacing w:after="120"/>
+      </w:pPr>
+      <w:r>
+        <w:rPr>
+          <w:color w:val="404040"/>
+          <w:sz w:val="21"/>
+        </w:rPr>
+        <w:t>We recommend a phased implementation so the business sees value early while reducing delivery risk. Each phase builds on the previous one without disrupting day-to-day operations.</w:t>
+      </w:r>
+    </w:p>
+    <w:p>
+      <w:pPr>
+        <w:pStyle w:val="Heading2"/>
+        <w:spacing w:before="200" w:after="80"/>
+      </w:pPr>
+      <w:r>
+        <w:rPr>
+          <w:b/>
+          <w:color w:val="007B83"/>
+          <w:sz w:val="22"/>
+        </w:rPr>
+        <w:t>Phase 1 – Core Logistics Platform</w:t>
+      </w:r>
+    </w:p>
+    <w:p>
+      <w:pPr>
+        <w:pStyle w:val="ListBullet"/>
+        <w:spacing w:after="80"/>
+      </w:pPr>
+      <w:r>
+        <w:rPr>
+          <w:b/>
+          <w:color w:val="1A376C"/>
+          <w:sz w:val="21"/>
+        </w:rPr>
+        <w:t>User management</w:t>
+      </w:r>
+    </w:p>
+    <w:p>
+      <w:pPr>
+        <w:pStyle w:val="ListBullet"/>
+        <w:spacing w:after="80"/>
+      </w:pPr>
+      <w:r>
+        <w:rPr>
+          <w:b/>
+          <w:color w:val="1A376C"/>
+          <w:sz w:val="21"/>
+        </w:rPr>
+        <w:t>Security</w:t>
+      </w:r>
+    </w:p>
+    <w:p>
+      <w:pPr>
+        <w:pStyle w:val="ListBullet"/>
+        <w:spacing w:after="80"/>
+      </w:pPr>
+      <w:r>
+        <w:rPr>
+          <w:b/>
+          <w:color w:val="1A376C"/>
+          <w:sz w:val="21"/>
+        </w:rPr>
+        <w:t>Shipment creation</w:t>
+      </w:r>
+    </w:p>
+    <w:p>
+      <w:pPr>
+        <w:pStyle w:val="ListBullet"/>
+        <w:spacing w:after="80"/>
+      </w:pPr>
+      <w:r>
+        <w:rPr>
+          <w:b/>
+          <w:color w:val="1A376C"/>
+          <w:sz w:val="21"/>
+        </w:rPr>
+        <w:t>Shipment posting</w:t>
+      </w:r>
+    </w:p>
+    <w:p>
+      <w:pPr>
+        <w:pStyle w:val="ListBullet"/>
+        <w:spacing w:after="80"/>
+      </w:pPr>
+      <w:r>
+        <w:rPr>
+          <w:b/>
+          <w:color w:val="1A376C"/>
+          <w:sz w:val="21"/>
+        </w:rPr>
+        <w:t>Carrier matching</w:t>
+      </w:r>
+    </w:p>
+    <w:p>
+      <w:pPr>
+        <w:pStyle w:val="ListBullet"/>
+        <w:spacing w:after="80"/>
+      </w:pPr>
+      <w:r>
+        <w:rPr>
+          <w:b/>
+          <w:color w:val="1A376C"/>
+          <w:sz w:val="21"/>
+        </w:rPr>
+        <w:t>Shipment assignment</w:t>
+      </w:r>
+    </w:p>
+    <w:p>
+      <w:pPr>
+        <w:pStyle w:val="ListBullet"/>
+        <w:spacing w:after="80"/>
+      </w:pPr>
+      <w:r>
+        <w:rPr>
+          <w:b/>
+          <w:color w:val="1A376C"/>
+          <w:sz w:val="21"/>
+        </w:rPr>
+        <w:t>Driver management</w:t>
+      </w:r>
+    </w:p>
+    <w:p>
+      <w:pPr>
+        <w:pStyle w:val="ListBullet"/>
+        <w:spacing w:after="80"/>
+      </w:pPr>
+      <w:r>
+        <w:rPr>
+          <w:b/>
+          <w:color w:val="1A376C"/>
+          <w:sz w:val="21"/>
+        </w:rPr>
+        <w:t>Shipment status tracking</w:t>
+      </w:r>
+    </w:p>
+    <w:p>
+      <w:pPr>
+        <w:pStyle w:val="ListBullet"/>
+        <w:spacing w:after="80"/>
+      </w:pPr>
+      <w:r>
+        <w:rPr>
+          <w:b/>
+          <w:color w:val="1A376C"/>
+          <w:sz w:val="21"/>
+        </w:rPr>
+        <w:t>Ratings and reviews</w:t>
+      </w:r>
+    </w:p>
+    <w:p>
+      <w:pPr>
+        <w:pStyle w:val="Heading2"/>
+        <w:spacing w:before="200" w:after="80"/>
+      </w:pPr>
+      <w:r>
+        <w:rPr>
+          <w:b/>
+          <w:color w:val="007B83"/>
+          <w:sz w:val="22"/>
+        </w:rPr>
+        <w:t>Phase 2 – Live Tracking</w:t>
+      </w:r>
+    </w:p>
+    <w:p>
+      <w:pPr>
+        <w:pStyle w:val="ListBullet"/>
+        <w:spacing w:after="80"/>
+      </w:pPr>
+      <w:r>
+        <w:rPr>
+          <w:b/>
+          <w:color w:val="1A376C"/>
+          <w:sz w:val="21"/>
+        </w:rPr>
+        <w:t>GPS integration</w:t>
+      </w:r>
+    </w:p>
+    <w:p>
+      <w:pPr>
+        <w:pStyle w:val="ListBullet"/>
+        <w:spacing w:after="80"/>
+      </w:pPr>
+      <w:r>
+        <w:rPr>
+          <w:b/>
+          <w:color w:val="1A376C"/>
+          <w:sz w:val="21"/>
+        </w:rPr>
+        <w:t>Smartphone-based tracking</w:t>
+      </w:r>
+    </w:p>
+    <w:p>
+      <w:pPr>
+        <w:pStyle w:val="ListBullet"/>
+        <w:spacing w:after="80"/>
+      </w:pPr>
+      <w:r>
+        <w:rPr>
+          <w:b/>
+          <w:color w:val="1A376C"/>
+          <w:sz w:val="21"/>
+        </w:rPr>
+        <w:t>Real-time location monitoring</w:t>
+      </w:r>
+    </w:p>
+    <w:p>
+      <w:pPr>
+        <w:pStyle w:val="ListBullet"/>
+        <w:spacing w:after="80"/>
+      </w:pPr>
+      <w:r>
+        <w:rPr>
+          <w:b/>
+          <w:color w:val="1A376C"/>
+          <w:sz w:val="21"/>
+        </w:rPr>
+        <w:t>Tracking dashboards</w:t>
+      </w:r>
+    </w:p>
+    <w:p>
+      <w:pPr>
+        <w:pStyle w:val="Heading2"/>
+        <w:spacing w:before="200" w:after="80"/>
+      </w:pPr>
+      <w:r>
+        <w:rPr>
+          <w:b/>
+          <w:color w:val="007B83"/>
+          <w:sz w:val="22"/>
+        </w:rPr>
+        <w:t>Phase 3 – Route Optimization</w:t>
+      </w:r>
+    </w:p>
+    <w:p>
+      <w:pPr>
+        <w:pStyle w:val="ListBullet"/>
+        <w:spacing w:after="80"/>
+      </w:pPr>
+      <w:r>
+        <w:rPr>
+          <w:b/>
+          <w:color w:val="1A376C"/>
+          <w:sz w:val="21"/>
+        </w:rPr>
+        <w:t>Route planning</w:t>
+      </w:r>
+    </w:p>
+    <w:p>
+      <w:pPr>
+        <w:pStyle w:val="ListBullet"/>
+        <w:spacing w:after="80"/>
+      </w:pPr>
+      <w:r>
+        <w:rPr>
+          <w:b/>
+          <w:color w:val="1A376C"/>
+          <w:sz w:val="21"/>
+        </w:rPr>
+        <w:t>ETA prediction</w:t>
+      </w:r>
+    </w:p>
+    <w:p>
+      <w:pPr>
+        <w:pStyle w:val="ListBullet"/>
+        <w:spacing w:after="80"/>
+      </w:pPr>
+      <w:r>
+        <w:rPr>
+          <w:b/>
+          <w:color w:val="1A376C"/>
+          <w:sz w:val="21"/>
+        </w:rPr>
+        <w:t>Route monitoring</w:t>
+      </w:r>
+    </w:p>
+    <w:p>
+      <w:pPr>
+        <w:pStyle w:val="Heading2"/>
+        <w:spacing w:before="200" w:after="80"/>
+      </w:pPr>
+      <w:r>
+        <w:rPr>
+          <w:b/>
+          <w:color w:val="007B83"/>
+          <w:sz w:val="22"/>
+        </w:rPr>
+        <w:t>Phase 4 – Future Enhancements</w:t>
+      </w:r>
+    </w:p>
+    <w:p>
+      <w:pPr>
+        <w:pStyle w:val="ListBullet"/>
+        <w:spacing w:after="80"/>
+      </w:pPr>
+      <w:r>
+        <w:rPr>
+          <w:b/>
+          <w:color w:val="1A376C"/>
+          <w:sz w:val="21"/>
+        </w:rPr>
+        <w:t>Payment integration</w:t>
+      </w:r>
+    </w:p>
+    <w:p>
+      <w:pPr>
+        <w:pStyle w:val="ListBullet"/>
+        <w:spacing w:after="80"/>
+      </w:pPr>
+      <w:r>
+        <w:rPr>
+          <w:b/>
+          <w:color w:val="1A376C"/>
+          <w:sz w:val="21"/>
+        </w:rPr>
+        <w:t>Proof of delivery</w:t>
+      </w:r>
+    </w:p>
+    <w:p>
+      <w:pPr>
+        <w:pStyle w:val="ListBullet"/>
+        <w:spacing w:after="80"/>
+      </w:pPr>
+      <w:r>
+        <w:rPr>
+          <w:b/>
+          <w:color w:val="1A376C"/>
+          <w:sz w:val="21"/>
+        </w:rPr>
+        <w:t>Advanced analytics</w:t>
+      </w:r>
+    </w:p>
+    <w:p>
+      <w:pPr>
+        <w:pStyle w:val="ListBullet"/>
+        <w:spacing w:after="80"/>
+      </w:pPr>
+      <w:r>
+        <w:rPr>
+          <w:b/>
+          <w:color w:val="1A376C"/>
+          <w:sz w:val="21"/>
+        </w:rPr>
+        <w:t>Fleet management integration</w:t>
+      </w:r>
+    </w:p>
+    <w:p>
+      <w:pPr>
+        <w:pStyle w:val="ListBullet"/>
+        <w:spacing w:after="80"/>
+      </w:pPr>
+      <w:r>
+        <w:rPr>
+          <w:b/>
+          <w:color w:val="1A376C"/>
+          <w:sz w:val="21"/>
+        </w:rPr>
+        <w:t>Warehouse integration</w:t>
+      </w:r>
+    </w:p>
+    <w:p>
+      <w:pPr>
+        <w:pStyle w:val="ListBullet"/>
+        <w:spacing w:after="80"/>
+      </w:pPr>
+      <w:r>
+        <w:rPr>
+          <w:b/>
+          <w:color w:val="1A376C"/>
+          <w:sz w:val="21"/>
+        </w:rPr>
+        <w:t>AI-assisted forecasting</w:t>
+      </w:r>
+    </w:p>
+    <w:p>
+      <w:pPr>
+        <w:pStyle w:val="Heading2"/>
+        <w:spacing w:before="200" w:after="80"/>
+      </w:pPr>
+      <w:r>
+        <w:rPr>
+          <w:b/>
+          <w:color w:val="007B83"/>
+          <w:sz w:val="22"/>
+        </w:rPr>
+        <w:t>Development Philosophy</w:t>
+      </w:r>
+    </w:p>
+    <w:p>
+      <w:pPr>
+        <w:spacing w:after="120"/>
+      </w:pPr>
+      <w:r>
+        <w:rPr>
+          <w:color w:val="404040"/>
+          <w:sz w:val="21"/>
+        </w:rPr>
+        <w:t>The platform is designed to solve immediate operational challenges while creating a scalable foundation for future growth. Each phase adds value without requiring a full redesign, so the business can evolve its capabilities over time with confidence.</w:t>
       </w:r>
     </w:p>
     <w:p/>
@@ -1482,7 +2119,7 @@
         <w:color w:val="007B83"/>
         <w:sz w:val="18"/>
       </w:rPr>
-      <w:t>Logistics Platform  |  Proposal</w:t>
+      <w:t>Strategic Logistics Platform  |  Proposal</w:t>
     </w:r>
   </w:p>
 </w:hdr>

</xml_diff>